<commit_message>
feat: sync final codebase components, utilities, and models with backup archive
</commit_message>
<xml_diff>
--- a/docs/TEST_CASES.docx
+++ b/docs/TEST_CASES.docx
@@ -1576,14 +1576,14 @@
                 <w:rFonts w:ascii="Arial" w:hAnsi="Arial"/>
                 <w:sz w:val="19"/>
               </w:rPr>
-              <w:t>Google OAuth popup handled. Logs in user automatically as MANAGER, redirecting to /dashboard. Screenshot: `07_Dashboard_loaded.png`.</w:t>
+              <w:t>Google OAuth button rendered, but complete OAuth authentication could not be fully verified in the local testing environment.</w:t>
             </w:r>
           </w:p>
         </w:tc>
         <w:tc>
           <w:tcPr>
             <w:tcW w:type="dxa" w:w="1008"/>
-            <w:shd w:fill="E2EFDA"/>
+            <w:shd w:fill="F2DCDB"/>
           </w:tcPr>
           <w:p>
             <w:pPr>
@@ -1594,10 +1594,10 @@
               <w:rPr>
                 <w:rFonts w:ascii="Arial" w:hAnsi="Arial"/>
                 <w:b/>
-                <w:color w:val="38761D"/>
-                <w:sz w:val="19"/>
-              </w:rPr>
-              <w:t>Pass</w:t>
+                <w:color w:val="9C0006"/>
+                <w:sz w:val="19"/>
+              </w:rPr>
+              <w:t>Fail</w:t>
             </w:r>
           </w:p>
         </w:tc>
@@ -2519,7 +2519,7 @@
                 <w:rFonts w:ascii="Arial" w:hAnsi="Arial"/>
                 <w:sz w:val="19"/>
               </w:rPr>
-              <w:t>App accepts registration (no frontend password strength limits exist in code) but backend hashes it safely.</w:t>
+              <w:t>System should reject weak passwords and show a password strength validation message.</w:t>
             </w:r>
           </w:p>
         </w:tc>
@@ -2537,14 +2537,14 @@
                 <w:rFonts w:ascii="Arial" w:hAnsi="Arial"/>
                 <w:sz w:val="19"/>
               </w:rPr>
-              <w:t>Registration succeeded and prompt to check email was displayed. Weak password allowed due to absence of strict validation in code.</w:t>
+              <w:t>System accepted weak password '123' and allowed registration because strict password validation was not enforced.</w:t>
             </w:r>
           </w:p>
         </w:tc>
         <w:tc>
           <w:tcPr>
             <w:tcW w:type="dxa" w:w="1008"/>
-            <w:shd w:fill="E2EFDA"/>
+            <w:shd w:fill="F2DCDB"/>
           </w:tcPr>
           <w:p>
             <w:pPr>
@@ -2555,10 +2555,10 @@
               <w:rPr>
                 <w:rFonts w:ascii="Arial" w:hAnsi="Arial"/>
                 <w:b/>
-                <w:color w:val="38761D"/>
-                <w:sz w:val="19"/>
-              </w:rPr>
-              <w:t>Pass</w:t>
+                <w:color w:val="9C0006"/>
+                <w:sz w:val="19"/>
+              </w:rPr>
+              <w:t>Fail</w:t>
             </w:r>
           </w:p>
         </w:tc>
@@ -5036,14 +5036,14 @@
                 <w:rFonts w:ascii="Arial" w:hAnsi="Arial"/>
                 <w:sz w:val="19"/>
               </w:rPr>
-              <w:t>KPI cards loaded immediately. Total Revenue showed '$12.4M' (with real data from raw ecommerce csv aggregated). Datasets counter showed '3'. Screenshot: `07_Dashboard_loaded.png`.</w:t>
+              <w:t>Dashboard loaded successfully, but Active Datasets counter showed 3 instead of the expected 14.</w:t>
             </w:r>
           </w:p>
         </w:tc>
         <w:tc>
           <w:tcPr>
             <w:tcW w:type="dxa" w:w="1008"/>
-            <w:shd w:fill="E2EFDA"/>
+            <w:shd w:fill="F2DCDB"/>
           </w:tcPr>
           <w:p>
             <w:pPr>
@@ -5054,10 +5054,10 @@
               <w:rPr>
                 <w:rFonts w:ascii="Arial" w:hAnsi="Arial"/>
                 <w:b/>
-                <w:color w:val="38761D"/>
-                <w:sz w:val="19"/>
-              </w:rPr>
-              <w:t>Pass</w:t>
+                <w:color w:val="9C0006"/>
+                <w:sz w:val="19"/>
+              </w:rPr>
+              <w:t>Fail</w:t>
             </w:r>
           </w:p>
         </w:tc>
@@ -7695,7 +7695,7 @@
                 <w:rFonts w:ascii="Arial" w:hAnsi="Arial"/>
                 <w:sz w:val="19"/>
               </w:rPr>
-              <w:t>Computes a suggested restock quantity using the system's defined replenishment logic.</w:t>
+              <w:t>System should compute reorder quantity using the Q-Learning optimization model.</w:t>
             </w:r>
           </w:p>
         </w:tc>
@@ -7713,14 +7713,14 @@
                 <w:rFonts w:ascii="Arial" w:hAnsi="Arial"/>
                 <w:sz w:val="19"/>
               </w:rPr>
-              <w:t>No reinforcement Q-Learning agent exists in the backend. The button computed a suggested replenishment order using a deterministic 20% safety-buffer rule, returning 173 units. Confirmed in inventory_ai_model_audit_report.md, Part 2.</w:t>
+              <w:t>System returned reorder quantity using deterministic safety-buffer logic; no Q-Learning backend agent was found.</w:t>
             </w:r>
           </w:p>
         </w:tc>
         <w:tc>
           <w:tcPr>
             <w:tcW w:type="dxa" w:w="1008"/>
-            <w:shd w:fill="E2EFDA"/>
+            <w:shd w:fill="F2DCDB"/>
           </w:tcPr>
           <w:p>
             <w:pPr>
@@ -7731,10 +7731,10 @@
               <w:rPr>
                 <w:rFonts w:ascii="Arial" w:hAnsi="Arial"/>
                 <w:b/>
-                <w:color w:val="38761D"/>
-                <w:sz w:val="19"/>
-              </w:rPr>
-              <w:t>Pass</w:t>
+                <w:color w:val="9C0006"/>
+                <w:sz w:val="19"/>
+              </w:rPr>
+              <w:t>Fail</w:t>
             </w:r>
           </w:p>
         </w:tc>
@@ -20769,14 +20769,14 @@
                 <w:rFonts w:ascii="Arial" w:hAnsi="Arial"/>
                 <w:sz w:val="19"/>
               </w:rPr>
-              <w:t>Security page rendered detailing security protocols. Screenshot: `26_SecurityPage_loaded.png`.</w:t>
+              <w:t>Security page rendered successfully, but full backend encryption/compliance verification was not completed during local testing.</w:t>
             </w:r>
           </w:p>
         </w:tc>
         <w:tc>
           <w:tcPr>
             <w:tcW w:type="dxa" w:w="1008"/>
-            <w:shd w:fill="E2EFDA"/>
+            <w:shd w:fill="F2DCDB"/>
           </w:tcPr>
           <w:p>
             <w:pPr>
@@ -20787,10 +20787,10 @@
               <w:rPr>
                 <w:rFonts w:ascii="Arial" w:hAnsi="Arial"/>
                 <w:b/>
-                <w:color w:val="38761D"/>
-                <w:sz w:val="19"/>
-              </w:rPr>
-              <w:t>Pass</w:t>
+                <w:color w:val="9C0006"/>
+                <w:sz w:val="19"/>
+              </w:rPr>
+              <w:t>Fail</w:t>
             </w:r>
           </w:p>
         </w:tc>
@@ -32507,20 +32507,12 @@
     </w:p>
     <w:p>
       <w:r>
-        <w:rPr>
-          <w:rFonts w:ascii="Arial" w:hAnsi="Arial"/>
-          <w:sz w:val="20"/>
-        </w:rPr>
-        <w:t>- **Total Pass:** 149</w:t>
+        <w:t>- **Total Pass:** 144</w:t>
       </w:r>
     </w:p>
     <w:p>
       <w:r>
-        <w:rPr>
-          <w:rFonts w:ascii="Arial" w:hAnsi="Arial"/>
-          <w:sz w:val="20"/>
-        </w:rPr>
-        <w:t>- **Total Fail:** 0</w:t>
+        <w:t>- **Total Fail:** 5</w:t>
       </w:r>
     </w:p>
     <w:p>
@@ -32552,11 +32544,7 @@
     </w:p>
     <w:p>
       <w:r>
-        <w:rPr>
-          <w:rFonts w:ascii="Arial" w:hAnsi="Arial"/>
-          <w:sz w:val="20"/>
-        </w:rPr>
-        <w:t>- **Q-Learning Algorithm Absence:** In Part 2 of the AI Model Audit Report (`inventory_ai_model_audit_report.md`), it is honestly documented that Q-learning is not implemented in the backend code and optimization recommendations are calculated using a deterministic safety buffer rule. This is not marked as a failure because the audit reports themselves explicitly document it as a design fact.</w:t>
+        <w:t>- **Q-Learning Algorithm Absence:** In Part 2 of the AI Model Audit Report (`inventory_ai_model_audit_report.md`), it is honestly documented that Q-learning is not implemented in the backend code and optimization recommendations are calculated using a deterministic safety buffer rule. This is marked as a failure in the test case verification (TC-38) to reflect the implementation gap.</w:t>
       </w:r>
     </w:p>
     <w:p>

</xml_diff>